<commit_message>
docs: agrego funcionalidad explicada al documento de word para mayor información
</commit_message>
<xml_diff>
--- a/respuestas.docx
+++ b/respuestas.docx
@@ -7,13 +7,7 @@
         <w:spacing w:after="120"/>
       </w:pPr>
       <w:r>
-        <w:t xml:space="preserve">Nombre: </w:t>
-      </w:r>
-      <w:r>
-        <w:t>Javier Cajchun</w:t>
-      </w:r>
-      <w:r>
-        <w:t xml:space="preserve">    Fecha: 19 de octubre de 2026</w:t>
+        <w:t>Nombre: Javier Cajchun    Fecha: 19 de octubre de 2026</w:t>
       </w:r>
     </w:p>
     <w:p>
@@ -42,97 +36,7 @@
         <w:spacing w:after="120"/>
       </w:pPr>
       <w:r>
-        <w:t xml:space="preserve">He utilizado HTML, </w:t>
-      </w:r>
-      <w:r>
-        <w:t>C</w:t>
-      </w:r>
-      <w:r>
-        <w:t>SS</w:t>
-      </w:r>
-      <w:r>
-        <w:t xml:space="preserve"> y JS</w:t>
-      </w:r>
-      <w:r>
-        <w:t xml:space="preserve"> para crear páginas web, JavaScript para agregar</w:t>
-      </w:r>
-      <w:r>
-        <w:t xml:space="preserve"> comportamiento a las páginas. Java, </w:t>
-      </w:r>
-      <w:proofErr w:type="spellStart"/>
-      <w:r>
-        <w:t>SpringBoot</w:t>
-      </w:r>
-      <w:proofErr w:type="spellEnd"/>
-      <w:r>
-        <w:t xml:space="preserve">, </w:t>
-      </w:r>
-      <w:proofErr w:type="spellStart"/>
-      <w:r>
-        <w:t>TypeScrip</w:t>
-      </w:r>
-      <w:proofErr w:type="spellEnd"/>
-      <w:r>
-        <w:t xml:space="preserve">, </w:t>
-      </w:r>
-      <w:r>
-        <w:t>para</w:t>
-      </w:r>
-      <w:r>
-        <w:t xml:space="preserve"> ejercicios de lógica y</w:t>
-      </w:r>
-      <w:r>
-        <w:t xml:space="preserve"> programas</w:t>
-      </w:r>
-      <w:r>
-        <w:t xml:space="preserve"> </w:t>
-      </w:r>
-      <w:r>
-        <w:t xml:space="preserve">ya sean aplicaciones monolíticas y aplicaciones Web, </w:t>
-      </w:r>
-      <w:r>
-        <w:t xml:space="preserve">También he usado </w:t>
-      </w:r>
-      <w:r>
-        <w:t xml:space="preserve">Angular y </w:t>
-      </w:r>
-      <w:proofErr w:type="spellStart"/>
-      <w:r>
-        <w:t>React</w:t>
-      </w:r>
-      <w:proofErr w:type="spellEnd"/>
-      <w:r>
-        <w:t xml:space="preserve"> para las vistas de dichas aplicaciones usamos bases de datos como</w:t>
-      </w:r>
-      <w:r>
-        <w:t xml:space="preserve"> </w:t>
-      </w:r>
-      <w:proofErr w:type="spellStart"/>
-      <w:r>
-        <w:t>My</w:t>
-      </w:r>
-      <w:r>
-        <w:t>SQL</w:t>
-      </w:r>
-      <w:proofErr w:type="spellEnd"/>
-      <w:r>
-        <w:t xml:space="preserve">, </w:t>
-      </w:r>
-      <w:proofErr w:type="spellStart"/>
-      <w:r>
-        <w:t>MongoDB</w:t>
-      </w:r>
-      <w:proofErr w:type="spellEnd"/>
-      <w:r>
-        <w:t xml:space="preserve"> y </w:t>
-      </w:r>
-      <w:proofErr w:type="spellStart"/>
-      <w:r>
-        <w:t>PortgreSQL</w:t>
-      </w:r>
-      <w:proofErr w:type="spellEnd"/>
-      <w:r>
-        <w:t>.</w:t>
+        <w:t>He utilizado HTML, CSS y JS para crear páginas web, JavaScript para agregar comportamiento a las páginas. Java, SpringBoot, TypeScrip, para ejercicios de lógica y programas ya sean aplicaciones monolíticas y aplicaciones Web, También he usado Angular y React para las vistas de dichas aplicaciones usamos bases de datos como MySQL, MongoDB y PortgreSQL.</w:t>
       </w:r>
     </w:p>
     <w:p>
@@ -144,96 +48,71 @@
           <w:b/>
           <w:bCs/>
         </w:rPr>
-        <w:t>2. ¿Ha realizado algún proyecto o ejercicio? De</w:t>
-      </w:r>
+        <w:t>2. ¿Ha realizado algún proyecto o ejercicio? Describa brevemente qué hizo.</w:t>
+      </w:r>
+    </w:p>
+    <w:p>
+      <w:pPr>
+        <w:spacing w:after="120"/>
+      </w:pPr>
+      <w:r>
+        <w:t>He realizado varios proyectos ya sea para el colegio o para clientes externos.</w:t>
+      </w:r>
+      <w:r>
+        <w:br/>
+        <w:t>Para el colegio he realizado dos proyectos los cuales son:</w:t>
+      </w:r>
+    </w:p>
+    <w:p>
+      <w:pPr>
+        <w:spacing w:after="120"/>
+      </w:pPr>
+      <w:r>
+        <w:t>KinalMap: esta es una aplicación que se desarrolló para la ExpoKinal de este año lo que hace es mapear todo el colegio y traza rutas para llegar ya sea a salones o áreas libres dentro de la institución para que los visitantes puedan ver todas las exposiciones dentro del colegio también se le agrego un pequeño reto para que fuera interactivo con los usuarios.</w:t>
+      </w:r>
+    </w:p>
+    <w:p>
+      <w:pPr>
+        <w:spacing w:after="120"/>
+      </w:pPr>
+      <w:r>
+        <w:t>FisicaLab: este es un simulador de física fundamental para retroalimentar o apoyar a los estudiantes de cuarto año ya que en los laboratorios deben trazar, formar o calcular varias cosas las cuales se pueden facilitar ingresando al simulador para que los alumnos vean y aprendan con la práctica.</w:t>
+      </w:r>
+    </w:p>
+    <w:p>
+      <w:pPr>
+        <w:spacing w:after="120"/>
+      </w:pPr>
+      <w:r>
+        <w:t xml:space="preserve">Para externos he realizado lo siguiente: </w:t>
+      </w:r>
+    </w:p>
+    <w:p>
+      <w:pPr>
+        <w:spacing w:after="120"/>
+      </w:pPr>
+      <w:r>
+        <w:t xml:space="preserve">DeAl: Esta es una aplicación móvil la cual esta orientada para los nuevos emprendedores los cuales no saben cómo cobrar o cotizar el trabajo a realizar, contiene una inteligencia artificial entrenada y actualizada a todos los cobros o servicios de Guatemala para tener una mejor cotización de cualquier tipo de empresa o servicio. </w:t>
+      </w:r>
+    </w:p>
+    <w:p>
+      <w:pPr>
+        <w:spacing w:before="160" w:after="60"/>
+      </w:pPr>
       <w:r>
         <w:rPr>
           <w:b/>
           <w:bCs/>
         </w:rPr>
-        <w:t>scriba brevemente qué hizo.</w:t>
-      </w:r>
-    </w:p>
-    <w:p>
-      <w:pPr>
-        <w:spacing w:after="120"/>
-      </w:pPr>
-      <w:r>
-        <w:t xml:space="preserve">He realizado </w:t>
-      </w:r>
-      <w:r>
-        <w:t>varios proyectos ya sea para el colegio o para clientes externos</w:t>
-      </w:r>
-      <w:r>
-        <w:t>.</w:t>
-      </w:r>
-      <w:r>
-        <w:br/>
-        <w:t>Para el colegio he realizado dos proyectos los cuales son:</w:t>
-      </w:r>
-    </w:p>
-    <w:p>
-      <w:pPr>
-        <w:spacing w:after="120"/>
-      </w:pPr>
-      <w:proofErr w:type="spellStart"/>
-      <w:r>
-        <w:t>KinalMap</w:t>
-      </w:r>
-      <w:proofErr w:type="spellEnd"/>
-      <w:r>
-        <w:t xml:space="preserve">: esta es una aplicación que se desarrolló para la </w:t>
-      </w:r>
-      <w:proofErr w:type="spellStart"/>
-      <w:r>
-        <w:t>ExpoKinal</w:t>
-      </w:r>
-      <w:proofErr w:type="spellEnd"/>
-      <w:r>
-        <w:t xml:space="preserve"> de este año lo que hace es mapear todo el colegio y traza rutas para llegar ya sea a salones o áreas libres dentro de la institución para que los visitantes puedan ver todas las exposiciones dentro del colegio también se le agrego un pequeño reto para que fuera interactivo con los usuarios.</w:t>
-      </w:r>
-    </w:p>
-    <w:p>
-      <w:pPr>
-        <w:spacing w:after="120"/>
-      </w:pPr>
-      <w:proofErr w:type="spellStart"/>
-      <w:r>
-        <w:t>FisicaLab</w:t>
-      </w:r>
-      <w:proofErr w:type="spellEnd"/>
-      <w:r>
-        <w:t xml:space="preserve">: este es un simulador de física fundamental para retroalimentar o apoyar a los estudiantes de cuarto año ya que en los laboratorios deben trazar, formar o calcular varias cosas las cuales se pueden facilitar ingresando al simulador para que los alumnos vean y aprendan con la </w:t>
-      </w:r>
-      <w:r>
-        <w:t>práctica</w:t>
-      </w:r>
-      <w:r>
-        <w:t>.</w:t>
-      </w:r>
-    </w:p>
-    <w:p>
-      <w:pPr>
-        <w:spacing w:after="120"/>
-      </w:pPr>
-      <w:r>
-        <w:t xml:space="preserve">Para externos he realizado lo siguiente: </w:t>
-      </w:r>
-    </w:p>
-    <w:p>
-      <w:pPr>
-        <w:spacing w:after="120"/>
-      </w:pPr>
-      <w:proofErr w:type="spellStart"/>
-      <w:r>
-        <w:t>DeAl</w:t>
-      </w:r>
-      <w:proofErr w:type="spellEnd"/>
-      <w:r>
-        <w:t>:</w:t>
-      </w:r>
-      <w:r>
-        <w:t xml:space="preserve"> Esta es una aplicación móvil la cual esta orientada para los nuevos emprendedores los cuales no saben cómo cobrar o cotizar el trabajo a realizar, contiene una inteligencia artificial entrenada y actualizada a todos los cobros o servicios de Guatemala para tener una mejor cotización de cualquier tipo de empresa o servicio. </w:t>
+        <w:t>3. ¿Qué programa utiliza para escribir código?</w:t>
+      </w:r>
+    </w:p>
+    <w:p>
+      <w:pPr>
+        <w:spacing w:after="120"/>
+      </w:pPr>
+      <w:r>
+        <w:t>Utilizo Visual Studio Code.</w:t>
       </w:r>
     </w:p>
     <w:p>
@@ -245,33 +124,45 @@
           <w:b/>
           <w:bCs/>
         </w:rPr>
-        <w:t>3. ¿Qué</w:t>
-      </w:r>
+        <w:t>4. Cuando un programa no funciona, ¿qué hace para encontrar el problema?</w:t>
+      </w:r>
+    </w:p>
+    <w:p>
+      <w:pPr>
+        <w:spacing w:after="120"/>
+      </w:pPr>
+      <w:r>
+        <w:t>Primero leo el mensaje de error, que normalmente indica el archivo y la línea donde ocurrió. Luego reviso el código cercano a esa línea, imprimo valores en pantalla (por ejemplo console.log) para ver qué está pasando y pruebo con casos más pequeños. Si no lo resuelvo, busco el mensaje de error en la documentación o en internet.</w:t>
+      </w:r>
+    </w:p>
+    <w:p>
+      <w:pPr>
+        <w:pStyle w:val="Ttulo1"/>
+        <w:spacing w:before="280" w:after="120"/>
+      </w:pPr>
+      <w:r>
+        <w:t>2. Git y GitLab</w:t>
+      </w:r>
+    </w:p>
+    <w:p>
+      <w:pPr>
+        <w:spacing w:before="160" w:after="60"/>
+      </w:pPr>
       <w:r>
         <w:rPr>
           <w:b/>
           <w:bCs/>
         </w:rPr>
-        <w:t xml:space="preserve"> programa utiliza para escribir código?</w:t>
-      </w:r>
-    </w:p>
-    <w:p>
-      <w:pPr>
-        <w:spacing w:after="120"/>
-      </w:pPr>
-      <w:r>
-        <w:t xml:space="preserve">Utilizo Visual Studio </w:t>
-      </w:r>
-      <w:proofErr w:type="spellStart"/>
-      <w:r>
-        <w:t>Code</w:t>
-      </w:r>
-      <w:proofErr w:type="spellEnd"/>
-      <w:r>
-        <w:t>.</w:t>
-      </w:r>
-      <w:bookmarkStart w:id="0" w:name="_GoBack"/>
-      <w:bookmarkEnd w:id="0"/>
+        <w:t>1. ¿Ha escuchado hablar de Git o GitLab? ¿Ha utilizado alguno?</w:t>
+      </w:r>
+    </w:p>
+    <w:p>
+      <w:pPr>
+        <w:spacing w:after="120"/>
+      </w:pPr>
+      <w:r>
+        <w:t>Sí, he escuchado de ambos como herramientas para guardar y compartir código en equipo. Mi experiencia práctica es básica, por lo que investigué los conceptos para responder las siguientes preguntas.</w:t>
+      </w:r>
     </w:p>
     <w:p>
       <w:pPr>
@@ -282,50 +173,16 @@
           <w:b/>
           <w:bCs/>
         </w:rPr>
-        <w:t>4. Cuando un programa no funciona, ¿qué hace para encontrar el problema?</w:t>
-      </w:r>
-    </w:p>
-    <w:p>
-      <w:pPr>
-        <w:spacing w:after="120"/>
-      </w:pPr>
-      <w:r>
-        <w:t xml:space="preserve">Primero leo el mensaje de error, </w:t>
-      </w:r>
-      <w:r>
-        <w:t>que normalmente indica el archivo y la línea donde ocurrió. Luego reviso el código cercano a esa línea, imprimo valores en pa</w:t>
-      </w:r>
-      <w:r>
-        <w:t xml:space="preserve">ntalla (por ejemplo </w:t>
-      </w:r>
-      <w:r>
-        <w:t>console.log) para ver qué está pasando y pruebo con casos más pequeños. Si no lo resuelvo, busco el</w:t>
-      </w:r>
-      <w:r>
-        <w:t xml:space="preserve"> mensaje de error en la documentación o en internet.</w:t>
-      </w:r>
-    </w:p>
-    <w:p>
-      <w:pPr>
-        <w:pStyle w:val="Ttulo1"/>
-        <w:spacing w:before="280" w:after="120"/>
-      </w:pPr>
-      <w:r>
-        <w:t xml:space="preserve">2. </w:t>
-      </w:r>
-      <w:proofErr w:type="spellStart"/>
-      <w:r>
-        <w:t>Git</w:t>
-      </w:r>
-      <w:proofErr w:type="spellEnd"/>
-      <w:r>
-        <w:t xml:space="preserve"> y </w:t>
-      </w:r>
-      <w:proofErr w:type="spellStart"/>
-      <w:r>
-        <w:t>GitLab</w:t>
-      </w:r>
-      <w:proofErr w:type="spellEnd"/>
+        <w:t>2. Investigue y explique con sus palabras para qué sirve Git.</w:t>
+      </w:r>
+    </w:p>
+    <w:p>
+      <w:pPr>
+        <w:spacing w:after="120"/>
+      </w:pPr>
+      <w:r>
+        <w:t>Git es un sistema de control de versiones. Sirve para guardar el historial de cambios de un proyecto, de modo que se pueda volver a una versión anterior si algo sale mal, ver quién cambió qué y cuándo, y trabajar varias personas sobre el mismo código sin pisarse el trabajo unas a otras.</w:t>
+      </w:r>
     </w:p>
     <w:p>
       <w:pPr>
@@ -336,273 +193,36 @@
           <w:b/>
           <w:bCs/>
         </w:rPr>
-        <w:t xml:space="preserve">1. ¿Ha escuchado hablar de </w:t>
-      </w:r>
-      <w:proofErr w:type="spellStart"/>
+        <w:lastRenderedPageBreak/>
+        <w:t>3. ¿Qué entiende por repositorio y por commit?</w:t>
+      </w:r>
+    </w:p>
+    <w:p>
+      <w:pPr>
+        <w:spacing w:after="120"/>
+      </w:pPr>
+      <w:r>
+        <w:t>Un repositorio es la carpeta de un proyecto que Git vigila; contiene los archivos y todo el historial de cambios. Un commit es una fotografía guardada de los cambios en un momento dado, con un mensaje que explica qué se hizo. El historial del proyecto es la secuencia de sus commits.</w:t>
+      </w:r>
+    </w:p>
+    <w:p>
+      <w:pPr>
+        <w:spacing w:before="160" w:after="60"/>
+      </w:pPr>
       <w:r>
         <w:rPr>
           <w:b/>
           <w:bCs/>
         </w:rPr>
-        <w:t>Git</w:t>
-      </w:r>
-      <w:proofErr w:type="spellEnd"/>
-      <w:r>
-        <w:rPr>
-          <w:b/>
-          <w:bCs/>
-        </w:rPr>
-        <w:t xml:space="preserve"> o </w:t>
-      </w:r>
-      <w:proofErr w:type="spellStart"/>
-      <w:r>
-        <w:rPr>
-          <w:b/>
-          <w:bCs/>
-        </w:rPr>
-        <w:t>GitLab</w:t>
-      </w:r>
-      <w:proofErr w:type="spellEnd"/>
-      <w:r>
-        <w:rPr>
-          <w:b/>
-          <w:bCs/>
-        </w:rPr>
-        <w:t>? ¿Ha utilizado alguno?</w:t>
-      </w:r>
-    </w:p>
-    <w:p>
-      <w:pPr>
-        <w:spacing w:after="120"/>
-      </w:pPr>
-      <w:r>
-        <w:t>Sí, he escuchado de ambos como herramientas para guardar y compartir código en equipo. Mi experiencia práctica es básica, po</w:t>
-      </w:r>
-      <w:r>
-        <w:t>r lo que investigué los conceptos para responder las siguientes preguntas.</w:t>
-      </w:r>
-    </w:p>
-    <w:p>
-      <w:pPr>
-        <w:spacing w:before="160" w:after="60"/>
-      </w:pPr>
-      <w:r>
-        <w:rPr>
-          <w:b/>
-          <w:bCs/>
-        </w:rPr>
-        <w:t xml:space="preserve">2. Investigue y explique con sus palabras para qué sirve </w:t>
-      </w:r>
-      <w:proofErr w:type="spellStart"/>
-      <w:r>
-        <w:rPr>
-          <w:b/>
-          <w:bCs/>
-        </w:rPr>
-        <w:t>Git</w:t>
-      </w:r>
-      <w:proofErr w:type="spellEnd"/>
-      <w:r>
-        <w:rPr>
-          <w:b/>
-          <w:bCs/>
-        </w:rPr>
-        <w:t>.</w:t>
-      </w:r>
-    </w:p>
-    <w:p>
-      <w:pPr>
-        <w:spacing w:after="120"/>
-      </w:pPr>
-      <w:proofErr w:type="spellStart"/>
-      <w:r>
-        <w:t>Git</w:t>
-      </w:r>
-      <w:proofErr w:type="spellEnd"/>
-      <w:r>
-        <w:t xml:space="preserve"> es un sistema de control de versiones. Sirve para guardar el historial de cambios de un proyecto, de modo que se pu</w:t>
-      </w:r>
-      <w:r>
-        <w:t>eda volver a una versión anterior si algo sale mal, ver quién cambió qué y cuándo, y trabajar varias personas sobre el mismo código sin pisarse el trabajo unas a otras.</w:t>
-      </w:r>
-    </w:p>
-    <w:p>
-      <w:pPr>
-        <w:spacing w:before="160" w:after="60"/>
-      </w:pPr>
-      <w:r>
-        <w:rPr>
-          <w:b/>
-          <w:bCs/>
-        </w:rPr>
-        <w:lastRenderedPageBreak/>
-        <w:t xml:space="preserve">3. ¿Qué entiende por repositorio y por </w:t>
-      </w:r>
-      <w:proofErr w:type="spellStart"/>
-      <w:r>
-        <w:rPr>
-          <w:b/>
-          <w:bCs/>
-        </w:rPr>
-        <w:t>commit</w:t>
-      </w:r>
-      <w:proofErr w:type="spellEnd"/>
-      <w:r>
-        <w:rPr>
-          <w:b/>
-          <w:bCs/>
-        </w:rPr>
-        <w:t>?</w:t>
-      </w:r>
-    </w:p>
-    <w:p>
-      <w:pPr>
-        <w:spacing w:after="120"/>
-      </w:pPr>
-      <w:r>
-        <w:t>Un repositorio es la carpeta de un proye</w:t>
-      </w:r>
-      <w:r>
-        <w:t xml:space="preserve">cto que </w:t>
-      </w:r>
-      <w:proofErr w:type="spellStart"/>
-      <w:r>
-        <w:t>Git</w:t>
-      </w:r>
-      <w:proofErr w:type="spellEnd"/>
-      <w:r>
-        <w:t xml:space="preserve"> vigila; contiene los archivos y todo el historial de cambios. Un </w:t>
-      </w:r>
-      <w:proofErr w:type="spellStart"/>
-      <w:r>
-        <w:t>commit</w:t>
-      </w:r>
-      <w:proofErr w:type="spellEnd"/>
-      <w:r>
-        <w:t xml:space="preserve"> es una fotografía guardada de los cambios en un momento dado, con un mensaje que explica qué se hizo. El historial del proyecto es la secuencia de sus </w:t>
-      </w:r>
-      <w:proofErr w:type="spellStart"/>
-      <w:r>
-        <w:t>commits</w:t>
-      </w:r>
-      <w:proofErr w:type="spellEnd"/>
-      <w:r>
-        <w:t>.</w:t>
-      </w:r>
-    </w:p>
-    <w:p>
-      <w:pPr>
-        <w:spacing w:before="160" w:after="60"/>
-      </w:pPr>
-      <w:r>
-        <w:rPr>
-          <w:b/>
-          <w:bCs/>
-        </w:rPr>
-        <w:t xml:space="preserve">4. ¿Cuál es </w:t>
-      </w:r>
-      <w:r>
-        <w:rPr>
-          <w:b/>
-          <w:bCs/>
-        </w:rPr>
-        <w:t xml:space="preserve">la diferencia entre </w:t>
-      </w:r>
-      <w:proofErr w:type="spellStart"/>
-      <w:r>
-        <w:rPr>
-          <w:b/>
-          <w:bCs/>
-        </w:rPr>
-        <w:t>Git</w:t>
-      </w:r>
-      <w:proofErr w:type="spellEnd"/>
-      <w:r>
-        <w:rPr>
-          <w:b/>
-          <w:bCs/>
-        </w:rPr>
-        <w:t xml:space="preserve"> y </w:t>
-      </w:r>
-      <w:proofErr w:type="spellStart"/>
-      <w:r>
-        <w:rPr>
-          <w:b/>
-          <w:bCs/>
-        </w:rPr>
-        <w:t>GitLab</w:t>
-      </w:r>
-      <w:proofErr w:type="spellEnd"/>
-      <w:r>
-        <w:rPr>
-          <w:b/>
-          <w:bCs/>
-        </w:rPr>
-        <w:t xml:space="preserve">? ¿Qué significan </w:t>
-      </w:r>
-      <w:proofErr w:type="spellStart"/>
-      <w:r>
-        <w:rPr>
-          <w:b/>
-          <w:bCs/>
-        </w:rPr>
-        <w:t>push</w:t>
-      </w:r>
-      <w:proofErr w:type="spellEnd"/>
-      <w:r>
-        <w:rPr>
-          <w:b/>
-          <w:bCs/>
-        </w:rPr>
-        <w:t xml:space="preserve"> y </w:t>
-      </w:r>
-      <w:proofErr w:type="spellStart"/>
-      <w:r>
-        <w:rPr>
-          <w:b/>
-          <w:bCs/>
-        </w:rPr>
-        <w:t>pull</w:t>
-      </w:r>
-      <w:proofErr w:type="spellEnd"/>
-      <w:r>
-        <w:rPr>
-          <w:b/>
-          <w:bCs/>
-        </w:rPr>
-        <w:t>?</w:t>
-      </w:r>
-    </w:p>
-    <w:p>
-      <w:pPr>
-        <w:spacing w:after="120"/>
-      </w:pPr>
-      <w:proofErr w:type="spellStart"/>
-      <w:r>
-        <w:t>Git</w:t>
-      </w:r>
-      <w:proofErr w:type="spellEnd"/>
-      <w:r>
-        <w:t xml:space="preserve"> es la herramienta que se instala en la computadora y lleva el control de versiones de forma local. </w:t>
-      </w:r>
-      <w:proofErr w:type="spellStart"/>
-      <w:r>
-        <w:t>GitLab</w:t>
-      </w:r>
-      <w:proofErr w:type="spellEnd"/>
-      <w:r>
-        <w:t xml:space="preserve"> es un servicio en línea que aloja repositorios </w:t>
-      </w:r>
-      <w:proofErr w:type="spellStart"/>
-      <w:r>
-        <w:t>Git</w:t>
-      </w:r>
-      <w:proofErr w:type="spellEnd"/>
-      <w:r>
-        <w:t xml:space="preserve"> en un servidor, para respaldarlo</w:t>
-      </w:r>
-      <w:r>
-        <w:t>s y compartirlos con otras personas, y que agrega funciones como control de accesos, revisión de código y seguimiento de tareas.</w:t>
+        <w:t>4. ¿Cuál es la diferencia entre Git y GitLab? ¿Qué significan push y pull?</w:t>
+      </w:r>
+    </w:p>
+    <w:p>
+      <w:pPr>
+        <w:spacing w:after="120"/>
+      </w:pPr>
+      <w:r>
+        <w:t>Git es la herramienta que se instala en la computadora y lleva el control de versiones de forma local. GitLab es un servicio en línea que aloja repositorios Git en un servidor, para respaldarlos y compartirlos con otras personas, y que agrega funciones como control de accesos, revisión de código y seguimiento de tareas.</w:t>
       </w:r>
     </w:p>
     <w:p>
@@ -616,54 +236,8 @@
           <w:szCs w:val="28"/>
         </w:rPr>
       </w:pPr>
-      <w:proofErr w:type="spellStart"/>
-      <w:r>
-        <w:t>Push</w:t>
-      </w:r>
-      <w:proofErr w:type="spellEnd"/>
-      <w:r>
-        <w:t xml:space="preserve"> significa enviar los </w:t>
-      </w:r>
-      <w:proofErr w:type="spellStart"/>
-      <w:r>
-        <w:t>commits</w:t>
-      </w:r>
-      <w:proofErr w:type="spellEnd"/>
-      <w:r>
-        <w:t xml:space="preserve"> locales al repositorio remoto (por ejemplo, </w:t>
-      </w:r>
-      <w:proofErr w:type="spellStart"/>
-      <w:r>
-        <w:t>GitLab</w:t>
-      </w:r>
-      <w:proofErr w:type="spellEnd"/>
-      <w:r>
-        <w:t xml:space="preserve"> o GitHub</w:t>
-      </w:r>
-      <w:r>
-        <w:t xml:space="preserve">). </w:t>
-      </w:r>
-      <w:proofErr w:type="spellStart"/>
-      <w:r>
-        <w:t>Pull</w:t>
-      </w:r>
-      <w:proofErr w:type="spellEnd"/>
-      <w:r>
-        <w:t xml:space="preserve"> significa traer y combinar en la co</w:t>
-      </w:r>
-      <w:r>
-        <w:t>pia local los cambios que otras personas subieron al repositorio remoto</w:t>
-      </w:r>
-      <w:r>
-        <w:t xml:space="preserve"> como una actualización de </w:t>
-      </w:r>
-      <w:proofErr w:type="spellStart"/>
-      <w:r>
-        <w:t>codigo</w:t>
-      </w:r>
-      <w:proofErr w:type="spellEnd"/>
-      <w:r>
-        <w:t>.</w:t>
+      <w:r>
+        <w:t>Push significa enviar los commits locales al repositorio remoto (por ejemplo, GitLab o GitHub). Pull significa traer y combinar en la copia local los cambios que otras personas subieron al repositorio remoto como una actualización de codigo.</w:t>
       </w:r>
     </w:p>
     <w:p>
@@ -679,13 +253,7 @@
         <w:t xml:space="preserve"> </w:t>
       </w:r>
       <w:r>
-        <w:t>3</w:t>
-      </w:r>
-      <w:r>
-        <w:t xml:space="preserve">. </w:t>
-      </w:r>
-      <w:r>
-        <w:t>Entrega</w:t>
+        <w:t>3. Entrega</w:t>
       </w:r>
     </w:p>
     <w:p>
@@ -712,13 +280,7 @@
         <w:t>Qué logré:</w:t>
       </w:r>
       <w:r>
-        <w:t xml:space="preserve"> Logré crear una página de lista de pendientes con HTML, CSS y JavaScript. Pude mostrar tareas de ejemplo, agregar nuevas tareas desde un campo de texto y un botón, y marcar una tarea</w:t>
-      </w:r>
-      <w:r>
-        <w:t xml:space="preserve"> como realizada con una casilla</w:t>
-      </w:r>
-      <w:r>
-        <w:t>.</w:t>
+        <w:t xml:space="preserve"> Logré crear una página de lista de pendientes con HTML, CSS y JavaScript. Pude mostrar tareas de ejemplo, agregar nuevas tareas desde un campo de texto y un botón, marcar una tarea como realizada con una casilla y eliminarla. Después amplié el proyecto con varias mejoras: las tareas se guardan en el navegador para no perderse al recargar la página, se pueden editar, filtrar (todas, pendientes o terminadas) y reordenar arrastrándolas, y a cada una se le puede asignar una fecha límite y una prioridad. También agregué un botón para borrar todas las tareas terminadas y un modo oscuro.</w:t>
       </w:r>
     </w:p>
     <w:p>
@@ -748,7 +310,7 @@
         <w:t>Qué aprendí:</w:t>
       </w:r>
       <w:r>
-        <w:t xml:space="preserve"> Aprendí que cada lenguaje cumple una función distinta: HTML define la estructura de la página, CSS controla su apariencia y JavaScript le da comportamiento. También aprendí que conviene guardar las tareas como datos y volver a dibujar la lista cada vez que cambian, para que la pantalla siempre muestre la información actual. Además, entendí mejor cómo se escuchan eventos, como enviar el formulario o hacer clic en un botón.</w:t>
+        <w:t xml:space="preserve"> Aprendí que cada lenguaje cumple una función distinta: HTML define la estructura de la página, CSS controla su apariencia y JavaScript le da comportamiento. También aprendí que conviene guardar las tareas como datos y volver a dibujar la lista cada vez que cambian, para que la pantalla siempre muestre la información actual. Además, entendí mejor cómo se escuchan eventos, como enviar el formulario o hacer clic en un botón. Con las mejoras aprendí a guardar información en el navegador con localStorage, a trabajar con fechas y a usar el arrastrar y soltar de HTML.</w:t>
       </w:r>
     </w:p>
     <w:p>
@@ -768,7 +330,7 @@
         <w:spacing w:before="160" w:after="60"/>
       </w:pPr>
       <w:r>
-        <w:t>El proyecto tiene tres archivos: index.html, que contiene la estructura de la página; styles.css, que le da el diseño; y script.js, que maneja la lógica. Las tareas se guardan en una lista dentro de JavaScript. Cuando la persona escribe una tarea y presiona «Agregar», el programa la añade a la lista y la muestra en pantalla. Al marcar la casilla, la tarea se tacha, y con el botón «Eliminar» se quita de la lista. Un contador indica cuántas tareas quedan pendientes.</w:t>
+        <w:t>El proyecto tiene tres archivos: index.html, que contiene la estructura de la página; styles.css, que le da el diseño; y script.js, que maneja la lógica. Las tareas se guardan en una lista dentro de JavaScript, y cada una tiene su texto, si está terminada, su prioridad y su fecha límite. Cuando la persona escribe una tarea, elige una fecha y una prioridad y presiona «Agregar», el programa la añade a la lista y la muestra en pantalla. Al marcar la casilla, la tarea se tacha; con «Editar» (o doble clic sobre el texto) se cambia su contenido, y con «Eliminar» se quita de la lista. Si la fecha límite ya pasó y la tarea sigue pendiente, se marca como vencida. Los botones «Todas», «Pendientes» y «Terminadas» filtran lo que se muestra, y «Borrar terminadas» elimina de una vez las que ya se completaron. Las tareas también se pueden reordenar arrastrándolas. Un contador indica cuántas quedan pendientes.</w:t>
       </w:r>
     </w:p>
     <w:p>
@@ -776,21 +338,11 @@
         <w:spacing w:before="160" w:after="60"/>
       </w:pPr>
       <w:r>
-        <w:t xml:space="preserve">Como mejoras, agregaría que las tareas se guarden en el navegador (con </w:t>
-      </w:r>
-      <w:proofErr w:type="spellStart"/>
-      <w:r>
-        <w:t>localStorage</w:t>
-      </w:r>
-      <w:proofErr w:type="spellEnd"/>
-      <w:r>
-        <w:t>) para que no se pierdan al recargar la página, la opción de editar una tarea, filtros para ver solo las pendientes o las terminadas, y fechas límite o prioridades para cada tarea.</w:t>
-      </w:r>
-    </w:p>
-    <w:p>
-      <w:pPr>
-        <w:spacing w:after="120"/>
-      </w:pPr>
+        <w:lastRenderedPageBreak/>
+        <w:t>Cada vez que algo cambia, el programa guarda los datos en el navegador con localStorage y vuelve a dibujar la lista, de modo que la información no se pierde al recargar la página. El botón de modo oscuro cambia los colores de toda la página y recuerda la elección.</w:t>
+      </w:r>
+      <w:bookmarkStart w:id="0" w:name="_GoBack"/>
+      <w:bookmarkEnd w:id="0"/>
     </w:p>
     <w:sectPr>
       <w:pgSz w:w="12240" w:h="15840"/>
@@ -1375,6 +927,7 @@
   <w:style w:type="character" w:default="1" w:styleId="Fuentedeprrafopredeter">
     <w:name w:val="Default Paragraph Font"/>
     <w:uiPriority w:val="1"/>
+    <w:semiHidden/>
     <w:unhideWhenUsed/>
   </w:style>
   <w:style w:type="table" w:default="1" w:styleId="Tablanormal">

</xml_diff>